<commit_message>
Save local modifications for requests and notifications
</commit_message>
<xml_diff>
--- a/assets/templates/leave_template.docx
+++ b/assets/templates/leave_template.docx
@@ -1044,8 +1044,6 @@
           <w:rtl/>
         </w:rPr>
       </w:pPr>
-      <w:bookmarkStart w:id="0" w:name="_GoBack"/>
-      <w:bookmarkEnd w:id="0"/>
     </w:p>
     <w:p>
       <w:pPr>
@@ -1991,7 +1989,18 @@
           <w:szCs w:val="28"/>
           <w:rtl/>
         </w:rPr>
-        <w:t xml:space="preserve">نائب رئيس الجامعة للشئون </w:t>
+        <w:t xml:space="preserve">نائب </w:t>
+      </w:r>
+      <w:r>
+        <w:rPr>
+          <w:rFonts w:cs="Traditional Arabic" w:hint="cs"/>
+          <w:b/>
+          <w:bCs/>
+          <w:sz w:val="28"/>
+          <w:szCs w:val="28"/>
+          <w:rtl/>
+        </w:rPr>
+        <w:t xml:space="preserve">رئيس الجامعة للشئون </w:t>
       </w:r>
       <w:proofErr w:type="gramStart"/>
       <w:r>
@@ -2121,17 +2130,6 @@
           <w:rtl/>
         </w:rPr>
         <w:tab/>
-      </w:r>
-      <w:proofErr w:type="gramStart"/>
-      <w:r>
-        <w:rPr>
-          <w:rFonts w:cs="Traditional Arabic" w:hint="cs"/>
-          <w:b/>
-          <w:bCs/>
-          <w:sz w:val="28"/>
-          <w:szCs w:val="28"/>
-          <w:rtl/>
-        </w:rPr>
         <w:t xml:space="preserve">التاريخ </w:t>
       </w:r>
       <w:r>
@@ -2143,42 +2141,42 @@
           <w:szCs w:val="28"/>
           <w:rtl/>
         </w:rPr>
-        <w:t>:</w:t>
-      </w:r>
-      <w:proofErr w:type="gramEnd"/>
-      <w:r>
-        <w:rPr>
-          <w:rFonts w:cs="Traditional Arabic" w:hint="cs"/>
-          <w:b/>
-          <w:bCs/>
-          <w:sz w:val="28"/>
-          <w:szCs w:val="28"/>
-          <w:rtl/>
-        </w:rPr>
-        <w:t xml:space="preserve"> .........</w:t>
-      </w:r>
-      <w:r>
-        <w:rPr>
-          <w:rFonts w:cs="Traditional Arabic" w:hint="cs"/>
-          <w:b/>
-          <w:bCs/>
-          <w:sz w:val="28"/>
-          <w:szCs w:val="28"/>
-          <w:rtl/>
-        </w:rPr>
-        <w:t>..........................</w:t>
-      </w:r>
-      <w:r>
-        <w:rPr>
-          <w:rFonts w:cs="Traditional Arabic" w:hint="cs"/>
-          <w:b/>
-          <w:bCs/>
-          <w:sz w:val="28"/>
-          <w:szCs w:val="28"/>
-          <w:rtl/>
-        </w:rPr>
-        <w:t>......</w:t>
-      </w:r>
+        <w:t xml:space="preserve">: </w:t>
+      </w:r>
+      <w:r>
+        <w:rPr>
+          <w:rFonts w:cs="Traditional Arabic"/>
+          <w:b/>
+          <w:bCs/>
+          <w:sz w:val="28"/>
+          <w:szCs w:val="28"/>
+          <w:rtl/>
+        </w:rPr>
+        <w:t>{{</w:t>
+      </w:r>
+      <w:r>
+        <w:rPr>
+          <w:rFonts w:cs="Traditional Arabic"/>
+          <w:b/>
+          <w:bCs/>
+          <w:sz w:val="28"/>
+          <w:szCs w:val="28"/>
+        </w:rPr>
+        <w:t>vpDate</w:t>
+      </w:r>
+      <w:r>
+        <w:rPr>
+          <w:rFonts w:cs="Traditional Arabic"/>
+          <w:b/>
+          <w:bCs/>
+          <w:sz w:val="28"/>
+          <w:szCs w:val="28"/>
+          <w:rtl/>
+        </w:rPr>
+        <w:t>}}</w:t>
+      </w:r>
+      <w:bookmarkStart w:id="0" w:name="_GoBack"/>
+      <w:bookmarkEnd w:id="0"/>
     </w:p>
     <w:p>
       <w:pPr>
@@ -5253,7 +5251,7 @@
     </w:rPr>
   </w:style>
   <w:style w:type="paragraph" w:customStyle="1" w:styleId="10">
-    <w:name w:val=" سرد الفقرات1"/>
+    <w:name w:val="سرد الفقرات1"/>
     <w:basedOn w:val="a"/>
     <w:qFormat/>
     <w:rsid w:val="00AD6AB3"/>
@@ -5594,7 +5592,7 @@
 </file>
 
 <file path=customXml/itemProps1.xml><?xml version="1.0" encoding="utf-8"?>
-<ds:datastoreItem xmlns:ds="http://schemas.openxmlformats.org/officeDocument/2006/customXml" ds:itemID="{0C4F7645-410A-4817-841C-892EDE0130AD}">
+<ds:datastoreItem xmlns:ds="http://schemas.openxmlformats.org/officeDocument/2006/customXml" ds:itemID="{9873D491-9225-4091-9D52-E83D8607F05D}">
   <ds:schemaRefs>
     <ds:schemaRef ds:uri="http://schemas.openxmlformats.org/officeDocument/2006/bibliography"/>
   </ds:schemaRefs>

</xml_diff>